<commit_message>
Make the verified campaign result easy to trust and revisit
Persist the latest campaign in a deep link, expose verified model readiness, and publish the fourth DGX run plus adversarial QA evidence so judges can independently inspect the demonstrated result after a restart.

Constraint: Native localhost-only DGX deployment without Docker or cloud inference

Rejected: Claim three sub-ten-minute runs | only one qualifying measured run exists

Confidence: high

Scope-risk: moderate

Directive: Keep measured acceptance claims tied to archived campaign evidence

Tested: 46 backend tests, 8 frontend tests, 14 HTTP E2E tests, one-click lifecycle, DOCX a11y and 14-table geometry audits

Not-tested: Two additional real campaigns are still needed for the three-consecutive sub-ten-minute criterion
</commit_message>
<xml_diff>
--- a/docs/出海方舟OverseaArk-PRD-v1.1.docx
+++ b/docs/出海方舟OverseaArk-PRD-v1.1.docx
@@ -9079,6 +9079,15 @@
       </w:tr>
     </w:tbl>
     <w:p>
+      <w:r>
+        <w:rPr>
+          <w:rFonts w:ascii="Noto Sans CJK SC" w:hAnsi="Noto Sans CJK SC" w:eastAsia="Noto Sans CJK SC" w:cs="Noto Sans CJK SC"/>
+          <w:sz w:val="22"/>
+        </w:rPr>
+        <w:t>截至 2026-07-22 的实机证据：四轮真模型 Campaign 均达到 `completed`；第四轮六阶段全部一次成功，用时 `590.002615s`，成为首次低于 10 分钟的完整流程。AT-001 仍需再获得两轮连续达标证据，本 PRD 不将单轮达标表述为已完成三轮验收。</w:t>
+      </w:r>
+    </w:p>
+    <w:p>
       <w:pPr>
         <w:pStyle w:val="Heading1"/>
       </w:pPr>

</xml_diff>